<commit_message>
Retire second-Mac qualification by project decision
</commit_message>
<xml_diff>
--- a/doc/WASM/CCL_WebAssembly_Acceptance_Policy_and_Regression_Register_v1_7.docx
+++ b/doc/WASM/CCL_WebAssembly_Acceptance_Policy_and_Regression_Register_v1_7.docx
@@ -45,7 +45,20 @@
     <w:p>
       <w:r>
         <w:rPr/>
-        <w:t xml:space="preserve">Changes in v1.7. D7 requires generic C/C4/B entries and runtime adapters; specialized Lisp entries remain optional. Retains per-test contract binding with verified migration of original evidence, avoiding reruns after unrelated inventory additions. H(G) remains outside all scheduled acceptance gates at the user’s direction. C/C4/B correctness and all remaining regressions are required. Retains macOS x86-64 for native regression qualification and second-host reproduction. Historical platform-specific baselines remain in the history ledger; they do not impose current host requirements. R6 source preservation, independent review and all LL obligations remain in force.</w:t>
+        <w:t xml:space="preserve">Changes in v1.7. D7 requires generic C/C4/B entries and runtime adapters; specialized Lisp entries remain optional. Retains per-test contract binding with verified migration of original evidence, avoiding reruns after unrelated inventory additions. H(G) remains outside all scheduled acceptance gates at the user’s direction. C/C4/B correctness and all remaining regressions are required. Retains macOS x86-64 for native regression qualification. The user retired the second-host reproduction requirement on 2026-09-13; see </w:t>
+      </w:r>
+      <w:hyperlink r:id="rId3">
+        <w:r>
+          <w:rPr>
+            <w:color w:val="175C91"/>
+            <w:u w:val="single"/>
+          </w:rPr>
+          <w:t xml:space="preserve">the project decision</w:t>
+        </w:r>
+      </w:hyperlink>
+      <w:r>
+        <w:rPr/>
+        <w:t xml:space="preserve">. Historical platform-specific baselines remain in the history ledger; they do not impose current host requirements. R6 source preservation, independent review and all LL obligations remain in force.</w:t>
       </w:r>
     </w:p>
     <w:p>
@@ -158,7 +171,7 @@
         <w:rPr/>
         <w:t xml:space="preserve">Version 2 envelopes follow the </w:t>
       </w:r>
-      <w:hyperlink r:id="rId3">
+      <w:hyperlink r:id="rId4">
         <w:r>
           <w:rPr>
             <w:color w:val="175C91"/>
@@ -389,7 +402,7 @@
         <w:rPr/>
         <w:t xml:space="preserve">. Its bootstrap, tests, toolchain and execution disposition are recorded in </w:t>
       </w:r>
-      <w:hyperlink r:id="rId4">
+      <w:hyperlink r:id="rId5">
         <w:r>
           <w:rPr>
             <w:color w:val="175C91"/>
@@ -415,7 +428,7 @@
         <w:rPr/>
         <w:t xml:space="preserve"> and the </w:t>
       </w:r>
-      <w:hyperlink r:id="rId5">
+      <w:hyperlink r:id="rId6">
         <w:r>
           <w:rPr>
             <w:color w:val="175C91"/>
@@ -426,7 +439,20 @@
       </w:hyperlink>
       <w:r>
         <w:rPr/>
-        <w:t xml:space="preserve">. Repeat the same macOS target on a second Mac for S0-LL08-c. Same-host repeatability, second-host reproducibility and native behavior are separate claims.</w:t>
+        <w:t xml:space="preserve">. The </w:t>
+      </w:r>
+      <w:hyperlink r:id="rId3">
+        <w:r>
+          <w:rPr>
+            <w:color w:val="175C91"/>
+            <w:u w:val="single"/>
+          </w:rPr>
+          <w:t xml:space="preserve">13 September project decision</w:t>
+        </w:r>
+      </w:hyperlink>
+      <w:r>
+        <w:rPr/>
+        <w:t xml:space="preserve"> retires S0-LL08-c. Native behavior and same-host repeatability remain required; cross-host reproduction is outside the required scope.</w:t>
       </w:r>
     </w:p>
     <w:p>
@@ -434,7 +460,7 @@
         <w:rPr/>
         <w:t xml:space="preserve">Generated code is compared primarily at the FASL level; heap-image byte identity is not required, but image behavior and object-graph validity are. The </w:t>
       </w:r>
-      <w:hyperlink r:id="rId6">
+      <w:hyperlink r:id="rId7">
         <w:r>
           <w:rPr>
             <w:color w:val="175C91"/>
@@ -457,7 +483,7 @@
     <w:p>
       <w:r>
         <w:rPr/>
-        <w:t xml:space="preserve">Cross-host reproducibility is established by repeating the same build on a second host and diffing against the retained digests. Previously accepted Gate 0 results are preserved with their original evidence scope and are not promoted to full Stage 0 completion.</w:t>
+        <w:t xml:space="preserve">If cross-host reproducibility is claimed in future, it requires repeating the same build on a second host and comparing retained digests; no such claim is required or made here. Previously accepted Gate 0 results are preserved with their original evidence scope and are not promoted to full Stage 0 completion.</w:t>
       </w:r>
     </w:p>
     <w:p>
@@ -495,7 +521,7 @@
         <w:rPr/>
         <w:t xml:space="preserve">[P1] </w:t>
       </w:r>
-      <w:hyperlink r:id="rId7">
+      <w:hyperlink r:id="rId8">
         <w:r>
           <w:rPr>
             <w:color w:val="175C91"/>
@@ -514,7 +540,7 @@
         <w:rPr/>
         <w:t xml:space="preserve">[P2] </w:t>
       </w:r>
-      <w:hyperlink r:id="rId8">
+      <w:hyperlink r:id="rId9">
         <w:r>
           <w:rPr>
             <w:color w:val="175C91"/>
@@ -533,7 +559,7 @@
         <w:rPr/>
         <w:t xml:space="preserve">[P3] </w:t>
       </w:r>
-      <w:hyperlink r:id="rId9">
+      <w:hyperlink r:id="rId10">
         <w:r>
           <w:rPr>
             <w:color w:val="175C91"/>
@@ -552,7 +578,7 @@
         <w:rPr/>
         <w:t xml:space="preserve">[P4] </w:t>
       </w:r>
-      <w:hyperlink r:id="rId10">
+      <w:hyperlink r:id="rId11">
         <w:r>
           <w:rPr>
             <w:color w:val="175C91"/>
@@ -571,7 +597,7 @@
         <w:rPr/>
         <w:t xml:space="preserve">[P5] </w:t>
       </w:r>
-      <w:hyperlink r:id="rId11">
+      <w:hyperlink r:id="rId12">
         <w:r>
           <w:rPr>
             <w:color w:val="175C91"/>
@@ -590,7 +616,7 @@
         <w:rPr/>
         <w:t xml:space="preserve">[P6] </w:t>
       </w:r>
-      <w:hyperlink r:id="rId12">
+      <w:hyperlink r:id="rId13">
         <w:r>
           <w:rPr>
             <w:color w:val="175C91"/>
@@ -609,7 +635,7 @@
         <w:rPr/>
         <w:t xml:space="preserve">[P7] </w:t>
       </w:r>
-      <w:hyperlink r:id="rId13">
+      <w:hyperlink r:id="rId14">
         <w:r>
           <w:rPr>
             <w:color w:val="175C91"/>
@@ -628,7 +654,7 @@
         <w:rPr/>
         <w:t xml:space="preserve">[P7a] </w:t>
       </w:r>
-      <w:hyperlink r:id="rId14">
+      <w:hyperlink r:id="rId15">
         <w:r>
           <w:rPr>
             <w:color w:val="175C91"/>
@@ -647,7 +673,7 @@
         <w:rPr/>
         <w:t xml:space="preserve">[P7b] </w:t>
       </w:r>
-      <w:hyperlink r:id="rId15">
+      <w:hyperlink r:id="rId16">
         <w:r>
           <w:rPr>
             <w:color w:val="175C91"/>
@@ -666,7 +692,7 @@
         <w:rPr/>
         <w:t xml:space="preserve">[P7c] </w:t>
       </w:r>
-      <w:hyperlink r:id="rId16">
+      <w:hyperlink r:id="rId17">
         <w:r>
           <w:rPr>
             <w:color w:val="175C91"/>
@@ -685,7 +711,7 @@
         <w:rPr/>
         <w:t xml:space="preserve">[P7d] </w:t>
       </w:r>
-      <w:hyperlink r:id="rId17">
+      <w:hyperlink r:id="rId18">
         <w:r>
           <w:rPr>
             <w:color w:val="175C91"/>
@@ -704,7 +730,7 @@
         <w:rPr/>
         <w:t xml:space="preserve">[P7e] </w:t>
       </w:r>
-      <w:hyperlink r:id="rId18">
+      <w:hyperlink r:id="rId19">
         <w:r>
           <w:rPr>
             <w:color w:val="175C91"/>
@@ -723,7 +749,7 @@
         <w:rPr/>
         <w:t xml:space="preserve">[P8] </w:t>
       </w:r>
-      <w:hyperlink r:id="rId19">
+      <w:hyperlink r:id="rId20">
         <w:r>
           <w:rPr>
             <w:color w:val="175C91"/>
@@ -742,7 +768,7 @@
         <w:rPr/>
         <w:t xml:space="preserve">[P9] </w:t>
       </w:r>
-      <w:hyperlink r:id="rId20">
+      <w:hyperlink r:id="rId21">
         <w:r>
           <w:rPr>
             <w:color w:val="175C91"/>
@@ -761,7 +787,7 @@
         <w:rPr/>
         <w:t xml:space="preserve">[P10] </w:t>
       </w:r>
-      <w:hyperlink r:id="rId21">
+      <w:hyperlink r:id="rId22">
         <w:r>
           <w:rPr>
             <w:color w:val="175C91"/>
@@ -780,7 +806,7 @@
         <w:rPr/>
         <w:t xml:space="preserve">[P11] </w:t>
       </w:r>
-      <w:hyperlink r:id="rId22">
+      <w:hyperlink r:id="rId23">
         <w:r>
           <w:rPr>
             <w:color w:val="175C91"/>
@@ -799,7 +825,7 @@
         <w:rPr/>
         <w:t xml:space="preserve">[P12] </w:t>
       </w:r>
-      <w:hyperlink r:id="rId23">
+      <w:hyperlink r:id="rId24">
         <w:r>
           <w:rPr>
             <w:color w:val="175C91"/>
@@ -818,7 +844,7 @@
         <w:rPr/>
         <w:t xml:space="preserve">[P13] </w:t>
       </w:r>
-      <w:hyperlink r:id="rId24">
+      <w:hyperlink r:id="rId25">
         <w:r>
           <w:rPr>
             <w:color w:val="175C91"/>
@@ -837,7 +863,7 @@
         <w:rPr/>
         <w:t xml:space="preserve">[P14] </w:t>
       </w:r>
-      <w:hyperlink r:id="rId25">
+      <w:hyperlink r:id="rId26">
         <w:r>
           <w:rPr>
             <w:color w:val="175C91"/>
@@ -856,7 +882,7 @@
         <w:rPr/>
         <w:t xml:space="preserve">[P15] </w:t>
       </w:r>
-      <w:hyperlink r:id="rId26">
+      <w:hyperlink r:id="rId27">
         <w:r>
           <w:rPr>
             <w:color w:val="175C91"/>
@@ -875,7 +901,7 @@
         <w:rPr/>
         <w:t xml:space="preserve">[P16] </w:t>
       </w:r>
-      <w:hyperlink r:id="rId27">
+      <w:hyperlink r:id="rId28">
         <w:r>
           <w:rPr>
             <w:color w:val="175C91"/>
@@ -909,7 +935,7 @@
         <w:rPr/>
         <w:t xml:space="preserve">[W1] </w:t>
       </w:r>
-      <w:hyperlink r:id="rId28">
+      <w:hyperlink r:id="rId29">
         <w:r>
           <w:rPr>
             <w:color w:val="175C91"/>
@@ -1634,7 +1660,7 @@
     <w:p>
       <w:r>
         <w:rPr/>
-        <w:t xml:space="preserve">Required regression. Every stage binds code, image, modules, ABI schema, host compiler, test revision, options and logs to content hashes and rejects mixed builds; preserves native target files and acode identities mechanically; normalizes only characterized nonsemantic differences, never whole unexplained files; repeats cross-host and native-behavior checks separately and marks unavailable evidence BLOCKED or NOT RUN.</w:t>
+        <w:t xml:space="preserve">Required regression. Every stage binds code, image, modules, ABI schema, host compiler, test revision, options and logs to content hashes and rejects mixed builds; preserves native target files and acode identities mechanically; normalizes only characterized nonsemantic differences, never whole unexplained files; repeats native-behavior and same-host repeatability checks as separate claims and marks unavailable required evidence BLOCKED or NOT RUN. Cross-host reproduction is not required under the 2026-09-13 project decision.</w:t>
       </w:r>
     </w:p>
     <w:p>

</xml_diff>

<commit_message>
Adopt R6 source-location allowance and integrate reviewed bootstrap core
</commit_message>
<xml_diff>
--- a/doc/WASM/CCL_WebAssembly_Acceptance_Policy_and_Regression_Register_v1_7.docx
+++ b/doc/WASM/CCL_WebAssembly_Acceptance_Policy_and_Regression_Register_v1_7.docx
@@ -379,6 +379,35 @@
       </w:r>
     </w:p>
     <w:p>
+      <w:r>
+        <w:rPr/>
+        <w:t xml:space="preserve">User decision, 21 September 2026: A file gaining </w:t>
+      </w:r>
+      <w:r>
+        <w:rPr>
+          <w:rFonts w:ascii="Consolas" w:hAnsi="Consolas"/>
+        </w:rPr>
+        <w:t xml:space="preserve">#+wasm32-target</w:t>
+      </w:r>
+      <w:r>
+        <w:rPr/>
+        <w:t xml:space="preserve"> branches may differ in source locations only, shown by identical forms under every existing target's reader and identical decoded code. This allowance is limited to source-location metadata; executable bytes, non-location data, behavior and ABI remain subject to the comparisons above. See </w:t>
+      </w:r>
+      <w:hyperlink r:id="rId5">
+        <w:r>
+          <w:rPr>
+            <w:color w:val="175C91"/>
+            <w:u w:val="single"/>
+          </w:rPr>
+          <w:t xml:space="preserve">the decision and evidence</w:t>
+        </w:r>
+      </w:hyperlink>
+      <w:r>
+        <w:rPr/>
+        <w:t xml:space="preserve">.</w:t>
+      </w:r>
+    </w:p>
+    <w:p>
       <w:pPr>
         <w:pStyle w:val="Heading2"/>
       </w:pPr>
@@ -402,7 +431,7 @@
         <w:rPr/>
         <w:t xml:space="preserve">. Its bootstrap, tests, toolchain and execution disposition are recorded in </w:t>
       </w:r>
-      <w:hyperlink r:id="rId5">
+      <w:hyperlink r:id="rId6">
         <w:r>
           <w:rPr>
             <w:color w:val="175C91"/>
@@ -428,7 +457,7 @@
         <w:rPr/>
         <w:t xml:space="preserve"> and the </w:t>
       </w:r>
-      <w:hyperlink r:id="rId6">
+      <w:hyperlink r:id="rId7">
         <w:r>
           <w:rPr>
             <w:color w:val="175C91"/>
@@ -460,7 +489,7 @@
         <w:rPr/>
         <w:t xml:space="preserve">Generated code is compared primarily at the FASL level; heap-image byte identity is not required, but image behavior and object-graph validity are. The </w:t>
       </w:r>
-      <w:hyperlink r:id="rId7">
+      <w:hyperlink r:id="rId8">
         <w:r>
           <w:rPr>
             <w:color w:val="175C91"/>
@@ -521,7 +550,7 @@
         <w:rPr/>
         <w:t xml:space="preserve">[P1] </w:t>
       </w:r>
-      <w:hyperlink r:id="rId8">
+      <w:hyperlink r:id="rId9">
         <w:r>
           <w:rPr>
             <w:color w:val="175C91"/>
@@ -540,7 +569,7 @@
         <w:rPr/>
         <w:t xml:space="preserve">[P2] </w:t>
       </w:r>
-      <w:hyperlink r:id="rId9">
+      <w:hyperlink r:id="rId10">
         <w:r>
           <w:rPr>
             <w:color w:val="175C91"/>
@@ -559,7 +588,7 @@
         <w:rPr/>
         <w:t xml:space="preserve">[P3] </w:t>
       </w:r>
-      <w:hyperlink r:id="rId10">
+      <w:hyperlink r:id="rId11">
         <w:r>
           <w:rPr>
             <w:color w:val="175C91"/>
@@ -578,7 +607,7 @@
         <w:rPr/>
         <w:t xml:space="preserve">[P4] </w:t>
       </w:r>
-      <w:hyperlink r:id="rId11">
+      <w:hyperlink r:id="rId12">
         <w:r>
           <w:rPr>
             <w:color w:val="175C91"/>
@@ -597,7 +626,7 @@
         <w:rPr/>
         <w:t xml:space="preserve">[P5] </w:t>
       </w:r>
-      <w:hyperlink r:id="rId12">
+      <w:hyperlink r:id="rId13">
         <w:r>
           <w:rPr>
             <w:color w:val="175C91"/>
@@ -616,7 +645,7 @@
         <w:rPr/>
         <w:t xml:space="preserve">[P6] </w:t>
       </w:r>
-      <w:hyperlink r:id="rId13">
+      <w:hyperlink r:id="rId14">
         <w:r>
           <w:rPr>
             <w:color w:val="175C91"/>
@@ -635,7 +664,7 @@
         <w:rPr/>
         <w:t xml:space="preserve">[P7] </w:t>
       </w:r>
-      <w:hyperlink r:id="rId14">
+      <w:hyperlink r:id="rId15">
         <w:r>
           <w:rPr>
             <w:color w:val="175C91"/>
@@ -654,7 +683,7 @@
         <w:rPr/>
         <w:t xml:space="preserve">[P7a] </w:t>
       </w:r>
-      <w:hyperlink r:id="rId15">
+      <w:hyperlink r:id="rId16">
         <w:r>
           <w:rPr>
             <w:color w:val="175C91"/>
@@ -673,7 +702,7 @@
         <w:rPr/>
         <w:t xml:space="preserve">[P7b] </w:t>
       </w:r>
-      <w:hyperlink r:id="rId16">
+      <w:hyperlink r:id="rId17">
         <w:r>
           <w:rPr>
             <w:color w:val="175C91"/>
@@ -692,7 +721,7 @@
         <w:rPr/>
         <w:t xml:space="preserve">[P7c] </w:t>
       </w:r>
-      <w:hyperlink r:id="rId17">
+      <w:hyperlink r:id="rId18">
         <w:r>
           <w:rPr>
             <w:color w:val="175C91"/>
@@ -711,7 +740,7 @@
         <w:rPr/>
         <w:t xml:space="preserve">[P7d] </w:t>
       </w:r>
-      <w:hyperlink r:id="rId18">
+      <w:hyperlink r:id="rId19">
         <w:r>
           <w:rPr>
             <w:color w:val="175C91"/>
@@ -730,7 +759,7 @@
         <w:rPr/>
         <w:t xml:space="preserve">[P7e] </w:t>
       </w:r>
-      <w:hyperlink r:id="rId19">
+      <w:hyperlink r:id="rId20">
         <w:r>
           <w:rPr>
             <w:color w:val="175C91"/>
@@ -749,7 +778,7 @@
         <w:rPr/>
         <w:t xml:space="preserve">[P8] </w:t>
       </w:r>
-      <w:hyperlink r:id="rId20">
+      <w:hyperlink r:id="rId21">
         <w:r>
           <w:rPr>
             <w:color w:val="175C91"/>
@@ -768,7 +797,7 @@
         <w:rPr/>
         <w:t xml:space="preserve">[P9] </w:t>
       </w:r>
-      <w:hyperlink r:id="rId21">
+      <w:hyperlink r:id="rId22">
         <w:r>
           <w:rPr>
             <w:color w:val="175C91"/>
@@ -787,7 +816,7 @@
         <w:rPr/>
         <w:t xml:space="preserve">[P10] </w:t>
       </w:r>
-      <w:hyperlink r:id="rId22">
+      <w:hyperlink r:id="rId23">
         <w:r>
           <w:rPr>
             <w:color w:val="175C91"/>
@@ -806,7 +835,7 @@
         <w:rPr/>
         <w:t xml:space="preserve">[P11] </w:t>
       </w:r>
-      <w:hyperlink r:id="rId23">
+      <w:hyperlink r:id="rId24">
         <w:r>
           <w:rPr>
             <w:color w:val="175C91"/>
@@ -825,7 +854,7 @@
         <w:rPr/>
         <w:t xml:space="preserve">[P12] </w:t>
       </w:r>
-      <w:hyperlink r:id="rId24">
+      <w:hyperlink r:id="rId25">
         <w:r>
           <w:rPr>
             <w:color w:val="175C91"/>
@@ -844,7 +873,7 @@
         <w:rPr/>
         <w:t xml:space="preserve">[P13] </w:t>
       </w:r>
-      <w:hyperlink r:id="rId25">
+      <w:hyperlink r:id="rId26">
         <w:r>
           <w:rPr>
             <w:color w:val="175C91"/>
@@ -863,7 +892,7 @@
         <w:rPr/>
         <w:t xml:space="preserve">[P14] </w:t>
       </w:r>
-      <w:hyperlink r:id="rId26">
+      <w:hyperlink r:id="rId27">
         <w:r>
           <w:rPr>
             <w:color w:val="175C91"/>
@@ -882,7 +911,7 @@
         <w:rPr/>
         <w:t xml:space="preserve">[P15] </w:t>
       </w:r>
-      <w:hyperlink r:id="rId27">
+      <w:hyperlink r:id="rId28">
         <w:r>
           <w:rPr>
             <w:color w:val="175C91"/>
@@ -901,7 +930,7 @@
         <w:rPr/>
         <w:t xml:space="preserve">[P16] </w:t>
       </w:r>
-      <w:hyperlink r:id="rId28">
+      <w:hyperlink r:id="rId29">
         <w:r>
           <w:rPr>
             <w:color w:val="175C91"/>
@@ -935,7 +964,7 @@
         <w:rPr/>
         <w:t xml:space="preserve">[W1] </w:t>
       </w:r>
-      <w:hyperlink r:id="rId29">
+      <w:hyperlink r:id="rId30">
         <w:r>
           <w:rPr>
             <w:color w:val="175C91"/>

</xml_diff>

<commit_message>
Fix audit154 floating trap modes and adopt two-ULP libm comparisons
</commit_message>
<xml_diff>
--- a/doc/WASM/CCL_WebAssembly_Acceptance_Policy_and_Regression_Register_v1_7.docx
+++ b/doc/WASM/CCL_WebAssembly_Acceptance_Policy_and_Regression_Register_v1_7.docx
@@ -1486,6 +1486,12 @@
       <w:r>
         <w:rPr/>
         <w:t xml:space="preserve">Required regression. Stage 1 for the required numeric subset, then Stages 2 and 4 for breadth: fixnum bounds, large and negative shifts, integer length, quotient/remainder and bignum carry/borrow compared with an independent oracle; mixed fixnum/float operations and compiler-policy variations; dispatch inspected for fallback recursion. A depth or fuel guard is not a semantic fix; the separately approved FP condition policy is preserved.</w:t>
+      </w:r>
+    </w:p>
+    <w:p>
+      <w:r>
+        <w:rPr/>
+        <w:t xml:space="preserve">Stage 1 libm decision (Steve, 21 September 2026: “Adopt musl and two ULP”): use the pinned musl implementation for the port’s transcendental primitives. Finite native comparisons may differ by at most two ULP; signed zeros, exact results and domain conditions remain exact. This is an acceptance limit for tested inputs, not a mathematical full-domain error bound or permission to mask floating-point conditions. Unsupported trap modes remain explicit refusals until qualified. The implementation, source hashes and license are retained with its qualification packet.</w:t>
       </w:r>
     </w:p>
     <w:p>

</xml_diff>